<commit_message>
Clarify packaging decisions and final report wording
</commit_message>
<xml_diff>
--- a/submission/Software_Security_Report.docx
+++ b/submission/Software_Security_Report.docx
@@ -1136,7 +1136,7 @@
         <w:widowControl/>
       </w:pPr>
       <w:r>
-        <w:t>The plan also determines gate decisions. The vulnerable milestone is retained as investigation evidence but fails release requirements. Confirmed authorization and validation violations must be fixed before the final candidate passes. During dependency analysis, the initially seeded pip version produced advisory findings. It was replaced with the approved newer version rather than added to an ignore list.</w:t>
+        <w:t>The plan also determines gate decisions. The vulnerable milestone is retained as investigation evidence but fails release requirements. Confirmed authorization and validation violations must be fixed before the final candidate passes. Packaging was later simplified: third-party packages are downloaded through a hash lock, while the required helper remains a local installable artifact. The release checks still reject unapproved bytes and installed dependencies.</w:t>
       </w:r>
     </w:p>
     <w:p>
@@ -1173,7 +1173,7 @@
         <w:widowControl/>
       </w:pPr>
       <w:r>
-        <w:t>The tests call both the public API and the internal service endpoints. It supplies legitimate test grants with the wrong subject, action, audience or dataset, attempts a Resource credential signed using Processor's key, submits altered CSV output and calls internal routes without authentication. The tests use temporary keys to construct these cases; no live credentials are published.</w:t>
+        <w:t>The tests call both the public API and the internal service endpoints. They supply legitimate test grants with the wrong subject, action, audience or dataset, attempts a Resource credential signed using Processor's key, submits altered CSV output and calls internal routes without authentication. The tests use temporary keys to construct these cases; no live credentials are published.</w:t>
       </w:r>
     </w:p>
     <w:p>
@@ -1661,7 +1661,7 @@
         <w:widowControl/>
       </w:pPr>
       <w:r>
-        <w:t>The supplied repository includes full Git history, the initial plan, architecture, access matrix, helper, Jenkinsfile, regression evidence and operating instructions. Submission requires publishing that history, configuring Jenkins and retaining actual push and pull-request build links. Name, student number, repository address and build links remain to be completed. The declaration is a separate attachment. No remote publication or student review is claimed.</w:t>
+        <w:t>The supplied repository includes full Git history, the initial plan, architecture, access matrix, helper, Jenkinsfile, regression evidence and operating instructions. Submission requires publishing that history, configuring Jenkins and retaining actual push and pull-request build links. Student number, repository address and build links remain to be completed. The declaration is a separate attachment. No remote publication or student review is claimed.</w:t>
       </w:r>
     </w:p>
     <w:p>
@@ -2527,7 +2527,7 @@
         <w:widowControl/>
       </w:pPr>
       <w:r>
-        <w:t>Main report narrative: 2491 words, excluding headings, tables, diagrams, references and this navigation page.</w:t>
+        <w:t>Main report narrative: 2495 words, excluding headings, tables, diagrams, references and this navigation page.</w:t>
       </w:r>
     </w:p>
     <w:sectPr>

</xml_diff>